<commit_message>
distribution-docs: refresh Paycom Historical Data Bot (v0.31.0)
</commit_message>
<xml_diff>
--- a/distribution-docs/Paycom Historical Data Bot.docx
+++ b/distribution-docs/Paycom Historical Data Bot.docx
@@ -51,7 +51,7 @@
           <w:sz w:val="16"/>
           <w:szCs w:val="16"/>
         </w:rPr>
-        <w:t xml:space="preserve">// @version      0.30.2</w:t>
+        <w:t xml:space="preserve">// @version      0.31.0</w:t>
       </w:r>
     </w:p>
     <w:p>
@@ -19694,6 +19694,58 @@
           <w:sz w:val="16"/>
           <w:szCs w:val="16"/>
         </w:rPr>
+        <w:t xml:space="preserve">  // Stamp of the queue row downloaded for the PREVIOUS range of this wizard run,</w:t>
+      </w:r>
+    </w:p>
+    <w:p>
+      <w:pPr>
+        <w:spacing w:after="0" w:line="220"/>
+      </w:pPr>
+      <w:r>
+        <w:rPr>
+          <w:rFonts w:ascii="Consolas" w:cs="Consolas" w:eastAsia="Consolas" w:hAnsi="Consolas"/>
+          <w:sz w:val="16"/>
+          <w:szCs w:val="16"/>
+        </w:rPr>
+        <w:t xml:space="preserve">  // so the next range can refuse to hand back the same row (see wizardDownload).</w:t>
+      </w:r>
+    </w:p>
+    <w:p>
+      <w:pPr>
+        <w:spacing w:after="0" w:line="220"/>
+      </w:pPr>
+      <w:r>
+        <w:rPr>
+          <w:rFonts w:ascii="Consolas" w:cs="Consolas" w:eastAsia="Consolas" w:hAnsi="Consolas"/>
+          <w:sz w:val="16"/>
+          <w:szCs w:val="16"/>
+        </w:rPr>
+        <w:t xml:space="preserve">  const WZ_LAST_STAMP_KEY = 'histbot.wz.lastStamp';</w:t>
+      </w:r>
+    </w:p>
+    <w:p>
+      <w:pPr>
+        <w:spacing w:after="0" w:line="220"/>
+      </w:pPr>
+      <w:r>
+        <w:rPr>
+          <w:rFonts w:ascii="Consolas" w:cs="Consolas" w:eastAsia="Consolas" w:hAnsi="Consolas"/>
+          <w:sz w:val="16"/>
+          <w:szCs w:val="16"/>
+        </w:rPr>
+        <w:t xml:space="preserve"> </w:t>
+      </w:r>
+    </w:p>
+    <w:p>
+      <w:pPr>
+        <w:spacing w:after="0" w:line="220"/>
+      </w:pPr>
+      <w:r>
+        <w:rPr>
+          <w:rFonts w:ascii="Consolas" w:cs="Consolas" w:eastAsia="Consolas" w:hAnsi="Consolas"/>
+          <w:sz w:val="16"/>
+          <w:szCs w:val="16"/>
+        </w:rPr>
         <w:t xml:space="preserve">  // Download the generated ARW report from the recent-reports tab.</w:t>
       </w:r>
     </w:p>
@@ -19707,6 +19759,240 @@
           <w:sz w:val="16"/>
           <w:szCs w:val="16"/>
         </w:rPr>
+        <w:t xml:space="preserve">  //</w:t>
+      </w:r>
+    </w:p>
+    <w:p>
+      <w:pPr>
+        <w:spacing w:after="0" w:line="220"/>
+      </w:pPr>
+      <w:r>
+        <w:rPr>
+          <w:rFonts w:ascii="Consolas" w:cs="Consolas" w:eastAsia="Consolas" w:hAnsi="Consolas"/>
+          <w:sz w:val="16"/>
+          <w:szCs w:val="16"/>
+        </w:rPr>
+        <w:t xml:space="preserve">  // Do NOT use the "count the Download buttons, wait for the count to rise, take</w:t>
+      </w:r>
+    </w:p>
+    <w:p>
+      <w:pPr>
+        <w:spacing w:after="0" w:line="220"/>
+      </w:pPr>
+      <w:r>
+        <w:rPr>
+          <w:rFonts w:ascii="Consolas" w:cs="Consolas" w:eastAsia="Consolas" w:hAnsi="Consolas"/>
+          <w:sz w:val="16"/>
+          <w:szCs w:val="16"/>
+        </w:rPr>
+        <w:t xml:space="preserve">  // the topmost" shortcut here. generateAndDownload can use it safely because it</w:t>
+      </w:r>
+    </w:p>
+    <w:p>
+      <w:pPr>
+        <w:spacing w:after="0" w:line="220"/>
+      </w:pPr>
+      <w:r>
+        <w:rPr>
+          <w:rFonts w:ascii="Consolas" w:cs="Consolas" w:eastAsia="Consolas" w:hAnsi="Consolas"/>
+          <w:sz w:val="16"/>
+          <w:szCs w:val="16"/>
+        </w:rPr>
+        <w:t xml:space="preserve">  // snapshots the count on the SAME page immediately before clicking Generate.</w:t>
+      </w:r>
+    </w:p>
+    <w:p>
+      <w:pPr>
+        <w:spacing w:after="0" w:line="220"/>
+      </w:pPr>
+      <w:r>
+        <w:rPr>
+          <w:rFonts w:ascii="Consolas" w:cs="Consolas" w:eastAsia="Consolas" w:hAnsi="Consolas"/>
+          <w:sz w:val="16"/>
+          <w:szCs w:val="16"/>
+        </w:rPr>
+        <w:t xml:space="preserve">  // The wizard can't: it clicks Generate on the wizard page and only then</w:t>
+      </w:r>
+    </w:p>
+    <w:p>
+      <w:pPr>
+        <w:spacing w:after="0" w:line="220"/>
+      </w:pPr>
+      <w:r>
+        <w:rPr>
+          <w:rFonts w:ascii="Consolas" w:cs="Consolas" w:eastAsia="Consolas" w:hAnsi="Consolas"/>
+          <w:sz w:val="16"/>
+          <w:szCs w:val="16"/>
+        </w:rPr>
+        <w:t xml:space="preserve">  // navigates to the queue, so the snapshot is taken on a freshly-loading list</w:t>
+      </w:r>
+    </w:p>
+    <w:p>
+      <w:pPr>
+        <w:spacing w:after="0" w:line="220"/>
+      </w:pPr>
+      <w:r>
+        <w:rPr>
+          <w:rFonts w:ascii="Consolas" w:cs="Consolas" w:eastAsia="Consolas" w:hAnsi="Consolas"/>
+          <w:sz w:val="16"/>
+          <w:szCs w:val="16"/>
+        </w:rPr>
+        <w:t xml:space="preserve">  // whose rows are still rendering. The count then rises because an OLD row</w:t>
+      </w:r>
+    </w:p>
+    <w:p>
+      <w:pPr>
+        <w:spacing w:after="0" w:line="220"/>
+      </w:pPr>
+      <w:r>
+        <w:rPr>
+          <w:rFonts w:ascii="Consolas" w:cs="Consolas" w:eastAsia="Consolas" w:hAnsi="Consolas"/>
+          <w:sz w:val="16"/>
+          <w:szCs w:val="16"/>
+        </w:rPr>
+        <w:t xml:space="preserve">  // rendered late — not because our report finished — and the topmost row is</w:t>
+      </w:r>
+    </w:p>
+    <w:p>
+      <w:pPr>
+        <w:spacing w:after="0" w:line="220"/>
+      </w:pPr>
+      <w:r>
+        <w:rPr>
+          <w:rFonts w:ascii="Consolas" w:cs="Consolas" w:eastAsia="Consolas" w:hAnsi="Consolas"/>
+          <w:sz w:val="16"/>
+          <w:szCs w:val="16"/>
+        </w:rPr>
+        <w:t xml:space="preserve">  // still the PREVIOUS range's. That silently saved 2023's file a second time as</w:t>
+      </w:r>
+    </w:p>
+    <w:p>
+      <w:pPr>
+        <w:spacing w:after="0" w:line="220"/>
+      </w:pPr>
+      <w:r>
+        <w:rPr>
+          <w:rFonts w:ascii="Consolas" w:cs="Consolas" w:eastAsia="Consolas" w:hAnsi="Consolas"/>
+          <w:sz w:val="16"/>
+          <w:szCs w:val="16"/>
+        </w:rPr>
+        <w:t xml:space="preserve">  // PriorPayroll_2024.csv (byte-identical, confirmed by md5) while the log</w:t>
+      </w:r>
+    </w:p>
+    <w:p>
+      <w:pPr>
+        <w:spacing w:after="0" w:line="220"/>
+      </w:pPr>
+      <w:r>
+        <w:rPr>
+          <w:rFonts w:ascii="Consolas" w:cs="Consolas" w:eastAsia="Consolas" w:hAnsi="Consolas"/>
+          <w:sz w:val="16"/>
+          <w:szCs w:val="16"/>
+        </w:rPr>
+        <w:t xml:space="preserve">  // happily reported both as downloaded.</w:t>
+      </w:r>
+    </w:p>
+    <w:p>
+      <w:pPr>
+        <w:spacing w:after="0" w:line="220"/>
+      </w:pPr>
+      <w:r>
+        <w:rPr>
+          <w:rFonts w:ascii="Consolas" w:cs="Consolas" w:eastAsia="Consolas" w:hAnsi="Consolas"/>
+          <w:sz w:val="16"/>
+          <w:szCs w:val="16"/>
+        </w:rPr>
+        <w:t xml:space="preserve">  //</w:t>
+      </w:r>
+    </w:p>
+    <w:p>
+      <w:pPr>
+        <w:spacing w:after="0" w:line="220"/>
+      </w:pPr>
+      <w:r>
+        <w:rPr>
+          <w:rFonts w:ascii="Consolas" w:cs="Consolas" w:eastAsia="Consolas" w:hAnsi="Consolas"/>
+          <w:sz w:val="16"/>
+          <w:szCs w:val="16"/>
+        </w:rPr>
+        <w:t xml:space="preserve">  // Our report is by definition the NEWEST row in the queue, so instead: wait</w:t>
+      </w:r>
+    </w:p>
+    <w:p>
+      <w:pPr>
+        <w:spacing w:after="0" w:line="220"/>
+      </w:pPr>
+      <w:r>
+        <w:rPr>
+          <w:rFonts w:ascii="Consolas" w:cs="Consolas" w:eastAsia="Consolas" w:hAnsi="Consolas"/>
+          <w:sz w:val="16"/>
+          <w:szCs w:val="16"/>
+        </w:rPr>
+        <w:t xml:space="preserve">  // until the newest row actually has a Download button, and refuse the stamp we</w:t>
+      </w:r>
+    </w:p>
+    <w:p>
+      <w:pPr>
+        <w:spacing w:after="0" w:line="220"/>
+      </w:pPr>
+      <w:r>
+        <w:rPr>
+          <w:rFonts w:ascii="Consolas" w:cs="Consolas" w:eastAsia="Consolas" w:hAnsi="Consolas"/>
+          <w:sz w:val="16"/>
+          <w:szCs w:val="16"/>
+        </w:rPr>
+        <w:t xml:space="preserve">  // downloaded for the previous range (that row being newest means ours has not</w:t>
+      </w:r>
+    </w:p>
+    <w:p>
+      <w:pPr>
+        <w:spacing w:after="0" w:line="220"/>
+      </w:pPr>
+      <w:r>
+        <w:rPr>
+          <w:rFonts w:ascii="Consolas" w:cs="Consolas" w:eastAsia="Consolas" w:hAnsi="Consolas"/>
+          <w:sz w:val="16"/>
+          <w:szCs w:val="16"/>
+        </w:rPr>
+        <w:t xml:space="preserve">  // appeared yet). Stamps are only ever compared to EACH OTHER, never to the</w:t>
+      </w:r>
+    </w:p>
+    <w:p>
+      <w:pPr>
+        <w:spacing w:after="0" w:line="220"/>
+      </w:pPr>
+      <w:r>
+        <w:rPr>
+          <w:rFonts w:ascii="Consolas" w:cs="Consolas" w:eastAsia="Consolas" w:hAnsi="Consolas"/>
+          <w:sz w:val="16"/>
+          <w:szCs w:val="16"/>
+        </w:rPr>
+        <w:t xml:space="preserve">  // clock — Paycom prints them in the client's timezone (CST here), which is not</w:t>
+      </w:r>
+    </w:p>
+    <w:p>
+      <w:pPr>
+        <w:spacing w:after="0" w:line="220"/>
+      </w:pPr>
+      <w:r>
+        <w:rPr>
+          <w:rFonts w:ascii="Consolas" w:cs="Consolas" w:eastAsia="Consolas" w:hAnsi="Consolas"/>
+          <w:sz w:val="16"/>
+          <w:szCs w:val="16"/>
+        </w:rPr>
+        <w:t xml:space="preserve">  // the browser's.</w:t>
+      </w:r>
+    </w:p>
+    <w:p>
+      <w:pPr>
+        <w:spacing w:after="0" w:line="220"/>
+      </w:pPr>
+      <w:r>
+        <w:rPr>
+          <w:rFonts w:ascii="Consolas" w:cs="Consolas" w:eastAsia="Consolas" w:hAnsi="Consolas"/>
+          <w:sz w:val="16"/>
+          <w:szCs w:val="16"/>
+        </w:rPr>
         <w:t xml:space="preserve">  async function wizardDownload(report, range) {</w:t>
       </w:r>
     </w:p>
@@ -19746,59 +20032,241 @@
           <w:sz w:val="16"/>
           <w:szCs w:val="16"/>
         </w:rPr>
-        <w:t xml:space="preserve">    const initial = getDownloadButtons().length;</w:t>
-      </w:r>
-    </w:p>
-    <w:p>
-      <w:pPr>
-        <w:spacing w:after="0" w:line="220"/>
-      </w:pPr>
-      <w:r>
-        <w:rPr>
-          <w:rFonts w:ascii="Consolas" w:cs="Consolas" w:eastAsia="Consolas" w:hAnsi="Consolas"/>
-          <w:sz w:val="16"/>
-          <w:szCs w:val="16"/>
-        </w:rPr>
-        <w:t xml:space="preserve">    await waitFor(() =&gt; getDownloadButtons().length &gt; initial, {</w:t>
-      </w:r>
-    </w:p>
-    <w:p>
-      <w:pPr>
-        <w:spacing w:after="0" w:line="220"/>
-      </w:pPr>
-      <w:r>
-        <w:rPr>
-          <w:rFonts w:ascii="Consolas" w:cs="Consolas" w:eastAsia="Consolas" w:hAnsi="Consolas"/>
-          <w:sz w:val="16"/>
-          <w:szCs w:val="16"/>
-        </w:rPr>
-        <w:t xml:space="preserve">      timeout: 30 * 60 * 1000, interval: 900, label: 'wizard report Download',</w:t>
-      </w:r>
-    </w:p>
-    <w:p>
-      <w:pPr>
-        <w:spacing w:after="0" w:line="220"/>
-      </w:pPr>
-      <w:r>
-        <w:rPr>
-          <w:rFonts w:ascii="Consolas" w:cs="Consolas" w:eastAsia="Consolas" w:hAnsi="Consolas"/>
-          <w:sz w:val="16"/>
-          <w:szCs w:val="16"/>
-        </w:rPr>
-        <w:t xml:space="preserve">    });</w:t>
-      </w:r>
-    </w:p>
-    <w:p>
-      <w:pPr>
-        <w:spacing w:after="0" w:line="220"/>
-      </w:pPr>
-      <w:r>
-        <w:rPr>
-          <w:rFonts w:ascii="Consolas" w:cs="Consolas" w:eastAsia="Consolas" w:hAnsi="Consolas"/>
-          <w:sz w:val="16"/>
-          <w:szCs w:val="16"/>
-        </w:rPr>
-        <w:t xml:space="preserve">    await downloadNewest(`${report.fileBase}_${range.label}`);</w:t>
+        <w:t xml:space="preserve"> </w:t>
+      </w:r>
+    </w:p>
+    <w:p>
+      <w:pPr>
+        <w:spacing w:after="0" w:line="220"/>
+      </w:pPr>
+      <w:r>
+        <w:rPr>
+          <w:rFonts w:ascii="Consolas" w:cs="Consolas" w:eastAsia="Consolas" w:hAnsi="Consolas"/>
+          <w:sz w:val="16"/>
+          <w:szCs w:val="16"/>
+        </w:rPr>
+        <w:t xml:space="preserve">    let lastStamp = '';</w:t>
+      </w:r>
+    </w:p>
+    <w:p>
+      <w:pPr>
+        <w:spacing w:after="0" w:line="220"/>
+      </w:pPr>
+      <w:r>
+        <w:rPr>
+          <w:rFonts w:ascii="Consolas" w:cs="Consolas" w:eastAsia="Consolas" w:hAnsi="Consolas"/>
+          <w:sz w:val="16"/>
+          <w:szCs w:val="16"/>
+        </w:rPr>
+        <w:t xml:space="preserve">    try { lastStamp = localStorage.getItem(WZ_LAST_STAMP_KEY) || ''; } catch (_) {}</w:t>
+      </w:r>
+    </w:p>
+    <w:p>
+      <w:pPr>
+        <w:spacing w:after="0" w:line="220"/>
+      </w:pPr>
+      <w:r>
+        <w:rPr>
+          <w:rFonts w:ascii="Consolas" w:cs="Consolas" w:eastAsia="Consolas" w:hAnsi="Consolas"/>
+          <w:sz w:val="16"/>
+          <w:szCs w:val="16"/>
+        </w:rPr>
+        <w:t xml:space="preserve"> </w:t>
+      </w:r>
+    </w:p>
+    <w:p>
+      <w:pPr>
+        <w:spacing w:after="0" w:line="220"/>
+      </w:pPr>
+      <w:r>
+        <w:rPr>
+          <w:rFonts w:ascii="Consolas" w:cs="Consolas" w:eastAsia="Consolas" w:hAnsi="Consolas"/>
+          <w:sz w:val="16"/>
+          <w:szCs w:val="16"/>
+        </w:rPr>
+        <w:t xml:space="preserve">    const found = await waitFor(() =&gt; {</w:t>
+      </w:r>
+    </w:p>
+    <w:p>
+      <w:pPr>
+        <w:spacing w:after="0" w:line="220"/>
+      </w:pPr>
+      <w:r>
+        <w:rPr>
+          <w:rFonts w:ascii="Consolas" w:cs="Consolas" w:eastAsia="Consolas" w:hAnsi="Consolas"/>
+          <w:sz w:val="16"/>
+          <w:szCs w:val="16"/>
+        </w:rPr>
+        <w:t xml:space="preserve">      const rows = [...scanQueueStamps().entries()]</w:t>
+      </w:r>
+    </w:p>
+    <w:p>
+      <w:pPr>
+        <w:spacing w:after="0" w:line="220"/>
+      </w:pPr>
+      <w:r>
+        <w:rPr>
+          <w:rFonts w:ascii="Consolas" w:cs="Consolas" w:eastAsia="Consolas" w:hAnsi="Consolas"/>
+          <w:sz w:val="16"/>
+          <w:szCs w:val="16"/>
+        </w:rPr>
+        <w:t xml:space="preserve">        .map(([stamp, el]) =&gt; ({ stamp, el, t: parseStamp(stamp) }))</w:t>
+      </w:r>
+    </w:p>
+    <w:p>
+      <w:pPr>
+        <w:spacing w:after="0" w:line="220"/>
+      </w:pPr>
+      <w:r>
+        <w:rPr>
+          <w:rFonts w:ascii="Consolas" w:cs="Consolas" w:eastAsia="Consolas" w:hAnsi="Consolas"/>
+          <w:sz w:val="16"/>
+          <w:szCs w:val="16"/>
+        </w:rPr>
+        <w:t xml:space="preserve">        .sort((a, b) =&gt; b.t - a.t); // newest first</w:t>
+      </w:r>
+    </w:p>
+    <w:p>
+      <w:pPr>
+        <w:spacing w:after="0" w:line="220"/>
+      </w:pPr>
+      <w:r>
+        <w:rPr>
+          <w:rFonts w:ascii="Consolas" w:cs="Consolas" w:eastAsia="Consolas" w:hAnsi="Consolas"/>
+          <w:sz w:val="16"/>
+          <w:szCs w:val="16"/>
+        </w:rPr>
+        <w:t xml:space="preserve">      const newest = rows[0];</w:t>
+      </w:r>
+    </w:p>
+    <w:p>
+      <w:pPr>
+        <w:spacing w:after="0" w:line="220"/>
+      </w:pPr>
+      <w:r>
+        <w:rPr>
+          <w:rFonts w:ascii="Consolas" w:cs="Consolas" w:eastAsia="Consolas" w:hAnsi="Consolas"/>
+          <w:sz w:val="16"/>
+          <w:szCs w:val="16"/>
+        </w:rPr>
+        <w:t xml:space="preserve">      if (!newest) return null;</w:t>
+      </w:r>
+    </w:p>
+    <w:p>
+      <w:pPr>
+        <w:spacing w:after="0" w:line="220"/>
+      </w:pPr>
+      <w:r>
+        <w:rPr>
+          <w:rFonts w:ascii="Consolas" w:cs="Consolas" w:eastAsia="Consolas" w:hAnsi="Consolas"/>
+          <w:sz w:val="16"/>
+          <w:szCs w:val="16"/>
+        </w:rPr>
+        <w:t xml:space="preserve">      // Newest row is the one we just downloaded → our new report isn't in the</w:t>
+      </w:r>
+    </w:p>
+    <w:p>
+      <w:pPr>
+        <w:spacing w:after="0" w:line="220"/>
+      </w:pPr>
+      <w:r>
+        <w:rPr>
+          <w:rFonts w:ascii="Consolas" w:cs="Consolas" w:eastAsia="Consolas" w:hAnsi="Consolas"/>
+          <w:sz w:val="16"/>
+          <w:szCs w:val="16"/>
+        </w:rPr>
+        <w:t xml:space="preserve">      // list yet. Keep waiting rather than handing back the same file again.</w:t>
+      </w:r>
+    </w:p>
+    <w:p>
+      <w:pPr>
+        <w:spacing w:after="0" w:line="220"/>
+      </w:pPr>
+      <w:r>
+        <w:rPr>
+          <w:rFonts w:ascii="Consolas" w:cs="Consolas" w:eastAsia="Consolas" w:hAnsi="Consolas"/>
+          <w:sz w:val="16"/>
+          <w:szCs w:val="16"/>
+        </w:rPr>
+        <w:t xml:space="preserve">      if (lastStamp &amp;&amp; newest.stamp === lastStamp) return null;</w:t>
+      </w:r>
+    </w:p>
+    <w:p>
+      <w:pPr>
+        <w:spacing w:after="0" w:line="220"/>
+      </w:pPr>
+      <w:r>
+        <w:rPr>
+          <w:rFonts w:ascii="Consolas" w:cs="Consolas" w:eastAsia="Consolas" w:hAnsi="Consolas"/>
+          <w:sz w:val="16"/>
+          <w:szCs w:val="16"/>
+        </w:rPr>
+        <w:t xml:space="preserve">      const btn = downloadButtonInRow(newest.el);</w:t>
+      </w:r>
+    </w:p>
+    <w:p>
+      <w:pPr>
+        <w:spacing w:after="0" w:line="220"/>
+      </w:pPr>
+      <w:r>
+        <w:rPr>
+          <w:rFonts w:ascii="Consolas" w:cs="Consolas" w:eastAsia="Consolas" w:hAnsi="Consolas"/>
+          <w:sz w:val="16"/>
+          <w:szCs w:val="16"/>
+        </w:rPr>
+        <w:t xml:space="preserve">      return btn ? { btn, stamp: newest.stamp } : null; // still generating → wait</w:t>
+      </w:r>
+    </w:p>
+    <w:p>
+      <w:pPr>
+        <w:spacing w:after="0" w:line="220"/>
+      </w:pPr>
+      <w:r>
+        <w:rPr>
+          <w:rFonts w:ascii="Consolas" w:cs="Consolas" w:eastAsia="Consolas" w:hAnsi="Consolas"/>
+          <w:sz w:val="16"/>
+          <w:szCs w:val="16"/>
+        </w:rPr>
+        <w:t xml:space="preserve">    }, { timeout: 30 * 60 * 1000, interval: 900, label: `${runLabel(report, range)} queue row` });</w:t>
+      </w:r>
+    </w:p>
+    <w:p>
+      <w:pPr>
+        <w:spacing w:after="0" w:line="220"/>
+      </w:pPr>
+      <w:r>
+        <w:rPr>
+          <w:rFonts w:ascii="Consolas" w:cs="Consolas" w:eastAsia="Consolas" w:hAnsi="Consolas"/>
+          <w:sz w:val="16"/>
+          <w:szCs w:val="16"/>
+        </w:rPr>
+        <w:t xml:space="preserve"> </w:t>
+      </w:r>
+    </w:p>
+    <w:p>
+      <w:pPr>
+        <w:spacing w:after="0" w:line="220"/>
+      </w:pPr>
+      <w:r>
+        <w:rPr>
+          <w:rFonts w:ascii="Consolas" w:cs="Consolas" w:eastAsia="Consolas" w:hAnsi="Consolas"/>
+          <w:sz w:val="16"/>
+          <w:szCs w:val="16"/>
+        </w:rPr>
+        <w:t xml:space="preserve">    await downloadViaButton(found.btn, `${report.fileBase}_${range.label}`);</w:t>
+      </w:r>
+    </w:p>
+    <w:p>
+      <w:pPr>
+        <w:spacing w:after="0" w:line="220"/>
+      </w:pPr>
+      <w:r>
+        <w:rPr>
+          <w:rFonts w:ascii="Consolas" w:cs="Consolas" w:eastAsia="Consolas" w:hAnsi="Consolas"/>
+          <w:sz w:val="16"/>
+          <w:szCs w:val="16"/>
+        </w:rPr>
+        <w:t xml:space="preserve">    try { localStorage.setItem(WZ_LAST_STAMP_KEY, found.stamp); } catch (_) {}</w:t>
       </w:r>
     </w:p>
     <w:p>
@@ -20007,6 +20475,45 @@
           <w:szCs w:val="16"/>
         </w:rPr>
         <w:t xml:space="preserve">      localStorage.removeItem(WZ_RANGE_IDX_KEY);</w:t>
+      </w:r>
+    </w:p>
+    <w:p>
+      <w:pPr>
+        <w:spacing w:after="0" w:line="220"/>
+      </w:pPr>
+      <w:r>
+        <w:rPr>
+          <w:rFonts w:ascii="Consolas" w:cs="Consolas" w:eastAsia="Consolas" w:hAnsi="Consolas"/>
+          <w:sz w:val="16"/>
+          <w:szCs w:val="16"/>
+        </w:rPr>
+        <w:t xml:space="preserve">      // Must be cleared too — a stamp left over from a previous run would make</w:t>
+      </w:r>
+    </w:p>
+    <w:p>
+      <w:pPr>
+        <w:spacing w:after="0" w:line="220"/>
+      </w:pPr>
+      <w:r>
+        <w:rPr>
+          <w:rFonts w:ascii="Consolas" w:cs="Consolas" w:eastAsia="Consolas" w:hAnsi="Consolas"/>
+          <w:sz w:val="16"/>
+          <w:szCs w:val="16"/>
+        </w:rPr>
+        <w:t xml:space="preserve">      // the next run's FIRST range sit and wait for a row newer than it.</w:t>
+      </w:r>
+    </w:p>
+    <w:p>
+      <w:pPr>
+        <w:spacing w:after="0" w:line="220"/>
+      </w:pPr>
+      <w:r>
+        <w:rPr>
+          <w:rFonts w:ascii="Consolas" w:cs="Consolas" w:eastAsia="Consolas" w:hAnsi="Consolas"/>
+          <w:sz w:val="16"/>
+          <w:szCs w:val="16"/>
+        </w:rPr>
+        <w:t xml:space="preserve">      localStorage.removeItem(WZ_LAST_STAMP_KEY);</w:t>
       </w:r>
     </w:p>
     <w:p>

</xml_diff>

<commit_message>
distribution-docs: refresh Paycom Historical Data Bot (v0.32.0)
</commit_message>
<xml_diff>
--- a/distribution-docs/Paycom Historical Data Bot.docx
+++ b/distribution-docs/Paycom Historical Data Bot.docx
@@ -51,7 +51,7 @@
           <w:sz w:val="16"/>
           <w:szCs w:val="16"/>
         </w:rPr>
-        <w:t xml:space="preserve">// @version      0.31.0</w:t>
+        <w:t xml:space="preserve">// @version      0.32.0</w:t>
       </w:r>
     </w:p>
     <w:p>
@@ -5030,6 +5030,123 @@
           <w:sz w:val="16"/>
           <w:szCs w:val="16"/>
         </w:rPr>
+        <w:t xml:space="preserve">  // Chrome throttles timers in BACKGROUND tabs to roughly once a minute, so the</w:t>
+      </w:r>
+    </w:p>
+    <w:p>
+      <w:pPr>
+        <w:spacing w:after="0" w:line="220"/>
+      </w:pPr>
+      <w:r>
+        <w:rPr>
+          <w:rFonts w:ascii="Consolas" w:cs="Consolas" w:eastAsia="Consolas" w:hAnsi="Consolas"/>
+          <w:sz w:val="16"/>
+          <w:szCs w:val="16"/>
+        </w:rPr>
+        <w:t xml:space="preserve">  // driver's heartbeat stops being punctual the moment the user looks at another</w:t>
+      </w:r>
+    </w:p>
+    <w:p>
+      <w:pPr>
+        <w:spacing w:after="0" w:line="220"/>
+      </w:pPr>
+      <w:r>
+        <w:rPr>
+          <w:rFonts w:ascii="Consolas" w:cs="Consolas" w:eastAsia="Consolas" w:hAnsi="Consolas"/>
+          <w:sz w:val="16"/>
+          <w:szCs w:val="16"/>
+        </w:rPr>
+        <w:t xml:space="preserve">  // tab — it is not dead, just throttled. The old 8s staleness window treated</w:t>
+      </w:r>
+    </w:p>
+    <w:p>
+      <w:pPr>
+        <w:spacing w:after="0" w:line="220"/>
+      </w:pPr>
+      <w:r>
+        <w:rPr>
+          <w:rFonts w:ascii="Consolas" w:cs="Consolas" w:eastAsia="Consolas" w:hAnsi="Consolas"/>
+          <w:sz w:val="16"/>
+          <w:szCs w:val="16"/>
+        </w:rPr>
+        <w:t xml:space="preserve">  // that as a crash: a second Paycom tab took over, and two tabs then drove the</w:t>
+      </w:r>
+    </w:p>
+    <w:p>
+      <w:pPr>
+        <w:spacing w:after="0" w:line="220"/>
+      </w:pPr>
+      <w:r>
+        <w:rPr>
+          <w:rFonts w:ascii="Consolas" w:cs="Consolas" w:eastAsia="Consolas" w:hAnsi="Consolas"/>
+          <w:sz w:val="16"/>
+          <w:szCs w:val="16"/>
+        </w:rPr>
+        <w:t xml:space="preserve">  // same queue at once. That interleaved two reports on one form (Employee Punch</w:t>
+      </w:r>
+    </w:p>
+    <w:p>
+      <w:pPr>
+        <w:spacing w:after="0" w:line="220"/>
+      </w:pPr>
+      <w:r>
+        <w:rPr>
+          <w:rFonts w:ascii="Consolas" w:cs="Consolas" w:eastAsia="Consolas" w:hAnsi="Consolas"/>
+          <w:sz w:val="16"/>
+          <w:szCs w:val="16"/>
+        </w:rPr>
+        <w:t xml:space="preserve">  // Change and Employee Rates by Allocation generated alternately), and the</w:t>
+      </w:r>
+    </w:p>
+    <w:p>
+      <w:pPr>
+        <w:spacing w:after="0" w:line="220"/>
+      </w:pPr>
+      <w:r>
+        <w:rPr>
+          <w:rFonts w:ascii="Consolas" w:cs="Consolas" w:eastAsia="Consolas" w:hAnsi="Consolas"/>
+          <w:sz w:val="16"/>
+          <w:szCs w:val="16"/>
+        </w:rPr>
+        <w:t xml:space="preserve">  // files those runs claimed to save never reached disk. The window must</w:t>
+      </w:r>
+    </w:p>
+    <w:p>
+      <w:pPr>
+        <w:spacing w:after="0" w:line="220"/>
+      </w:pPr>
+      <w:r>
+        <w:rPr>
+          <w:rFonts w:ascii="Consolas" w:cs="Consolas" w:eastAsia="Consolas" w:hAnsi="Consolas"/>
+          <w:sz w:val="16"/>
+          <w:szCs w:val="16"/>
+        </w:rPr>
+        <w:t xml:space="preserve">  // therefore sit comfortably above Chrome's ~60s throttled interval.</w:t>
+      </w:r>
+    </w:p>
+    <w:p>
+      <w:pPr>
+        <w:spacing w:after="0" w:line="220"/>
+      </w:pPr>
+      <w:r>
+        <w:rPr>
+          <w:rFonts w:ascii="Consolas" w:cs="Consolas" w:eastAsia="Consolas" w:hAnsi="Consolas"/>
+          <w:sz w:val="16"/>
+          <w:szCs w:val="16"/>
+        </w:rPr>
+        <w:t xml:space="preserve">  const LOCK_STALE_MS = 120000;</w:t>
+      </w:r>
+    </w:p>
+    <w:p>
+      <w:pPr>
+        <w:spacing w:after="0" w:line="220"/>
+      </w:pPr>
+      <w:r>
+        <w:rPr>
+          <w:rFonts w:ascii="Consolas" w:cs="Consolas" w:eastAsia="Consolas" w:hAnsi="Consolas"/>
+          <w:sz w:val="16"/>
+          <w:szCs w:val="16"/>
+        </w:rPr>
         <w:t xml:space="preserve">  const readLock = () =&gt; { try { return JSON.parse(localStorage.getItem(LOCK_KEY) || 'null'); } catch (_) { return null; } };</w:t>
       </w:r>
     </w:p>
@@ -5095,7 +5212,7 @@
           <w:sz w:val="16"/>
           <w:szCs w:val="16"/>
         </w:rPr>
-        <w:t xml:space="preserve">    return (Date.now() - (l.ts || 0)) &gt; 8000; // stale lock → safe to take over</w:t>
+        <w:t xml:space="preserve">    return (Date.now() - (l.ts || 0)) &gt; LOCK_STALE_MS; // genuinely dead → take over</w:t>
       </w:r>
     </w:p>
     <w:p>
@@ -5173,6 +5290,97 @@
           <w:sz w:val="16"/>
           <w:szCs w:val="16"/>
         </w:rPr>
+        <w:t xml:space="preserve">    // Stamp the lock on every visibility flip too: the beat just before the tab</w:t>
+      </w:r>
+    </w:p>
+    <w:p>
+      <w:pPr>
+        <w:spacing w:after="0" w:line="220"/>
+      </w:pPr>
+      <w:r>
+        <w:rPr>
+          <w:rFonts w:ascii="Consolas" w:cs="Consolas" w:eastAsia="Consolas" w:hAnsi="Consolas"/>
+          <w:sz w:val="16"/>
+          <w:szCs w:val="16"/>
+        </w:rPr>
+        <w:t xml:space="preserve">    // is backgrounded is the last punctual one it will get, and the beat when it</w:t>
+      </w:r>
+    </w:p>
+    <w:p>
+      <w:pPr>
+        <w:spacing w:after="0" w:line="220"/>
+      </w:pPr>
+      <w:r>
+        <w:rPr>
+          <w:rFonts w:ascii="Consolas" w:cs="Consolas" w:eastAsia="Consolas" w:hAnsi="Consolas"/>
+          <w:sz w:val="16"/>
+          <w:szCs w:val="16"/>
+        </w:rPr>
+        <w:t xml:space="preserve">    // comes back should land immediately rather than waiting for the interval.</w:t>
+      </w:r>
+    </w:p>
+    <w:p>
+      <w:pPr>
+        <w:spacing w:after="0" w:line="220"/>
+      </w:pPr>
+      <w:r>
+        <w:rPr>
+          <w:rFonts w:ascii="Consolas" w:cs="Consolas" w:eastAsia="Consolas" w:hAnsi="Consolas"/>
+          <w:sz w:val="16"/>
+          <w:szCs w:val="16"/>
+        </w:rPr>
+        <w:t xml:space="preserve">    if (!becomeDriver._vis) {</w:t>
+      </w:r>
+    </w:p>
+    <w:p>
+      <w:pPr>
+        <w:spacing w:after="0" w:line="220"/>
+      </w:pPr>
+      <w:r>
+        <w:rPr>
+          <w:rFonts w:ascii="Consolas" w:cs="Consolas" w:eastAsia="Consolas" w:hAnsi="Consolas"/>
+          <w:sz w:val="16"/>
+          <w:szCs w:val="16"/>
+        </w:rPr>
+        <w:t xml:space="preserve">      becomeDriver._vis = () =&gt; { const l = readLock(); if (l &amp;&amp; l.id === TAB_ID) heartbeat(); };</w:t>
+      </w:r>
+    </w:p>
+    <w:p>
+      <w:pPr>
+        <w:spacing w:after="0" w:line="220"/>
+      </w:pPr>
+      <w:r>
+        <w:rPr>
+          <w:rFonts w:ascii="Consolas" w:cs="Consolas" w:eastAsia="Consolas" w:hAnsi="Consolas"/>
+          <w:sz w:val="16"/>
+          <w:szCs w:val="16"/>
+        </w:rPr>
+        <w:t xml:space="preserve">      document.addEventListener('visibilitychange', becomeDriver._vis);</w:t>
+      </w:r>
+    </w:p>
+    <w:p>
+      <w:pPr>
+        <w:spacing w:after="0" w:line="220"/>
+      </w:pPr>
+      <w:r>
+        <w:rPr>
+          <w:rFonts w:ascii="Consolas" w:cs="Consolas" w:eastAsia="Consolas" w:hAnsi="Consolas"/>
+          <w:sz w:val="16"/>
+          <w:szCs w:val="16"/>
+        </w:rPr>
+        <w:t xml:space="preserve">    }</w:t>
+      </w:r>
+    </w:p>
+    <w:p>
+      <w:pPr>
+        <w:spacing w:after="0" w:line="220"/>
+      </w:pPr>
+      <w:r>
+        <w:rPr>
+          <w:rFonts w:ascii="Consolas" w:cs="Consolas" w:eastAsia="Consolas" w:hAnsi="Consolas"/>
+          <w:sz w:val="16"/>
+          <w:szCs w:val="16"/>
+        </w:rPr>
         <w:t xml:space="preserve">  }</w:t>
       </w:r>
     </w:p>
@@ -12063,6 +12271,19 @@
           <w:sz w:val="16"/>
           <w:szCs w:val="16"/>
         </w:rPr>
+        <w:t xml:space="preserve">    resetAttempt(getIndex()); // real progress → this report isn't redirect-looping</w:t>
+      </w:r>
+    </w:p>
+    <w:p>
+      <w:pPr>
+        <w:spacing w:after="0" w:line="220"/>
+      </w:pPr>
+      <w:r>
+        <w:rPr>
+          <w:rFonts w:ascii="Consolas" w:cs="Consolas" w:eastAsia="Consolas" w:hAnsi="Consolas"/>
+          <w:sz w:val="16"/>
+          <w:szCs w:val="16"/>
+        </w:rPr>
         <w:t xml:space="preserve">    await sleep(2500); // let the download commit before the next generate/navigation</w:t>
       </w:r>
     </w:p>
@@ -16847,6 +17068,162 @@
           <w:sz w:val="16"/>
           <w:szCs w:val="16"/>
         </w:rPr>
+        <w:t xml:space="preserve">  // Called after every successful download: the loop guard exists to catch a</w:t>
+      </w:r>
+    </w:p>
+    <w:p>
+      <w:pPr>
+        <w:spacing w:after="0" w:line="220"/>
+      </w:pPr>
+      <w:r>
+        <w:rPr>
+          <w:rFonts w:ascii="Consolas" w:cs="Consolas" w:eastAsia="Consolas" w:hAnsi="Consolas"/>
+          <w:sz w:val="16"/>
+          <w:szCs w:val="16"/>
+        </w:rPr>
+        <w:t xml:space="preserve">  // report whose page REDIRECTS on completion (it would otherwise re-generate</w:t>
+      </w:r>
+    </w:p>
+    <w:p>
+      <w:pPr>
+        <w:spacing w:after="0" w:line="220"/>
+      </w:pPr>
+      <w:r>
+        <w:rPr>
+          <w:rFonts w:ascii="Consolas" w:cs="Consolas" w:eastAsia="Consolas" w:hAnsi="Consolas"/>
+          <w:sz w:val="16"/>
+          <w:szCs w:val="16"/>
+        </w:rPr>
+        <w:t xml:space="preserve">  // forever), but a big multi-range report legitimately re-lands on its own page</w:t>
+      </w:r>
+    </w:p>
+    <w:p>
+      <w:pPr>
+        <w:spacing w:after="0" w:line="220"/>
+      </w:pPr>
+      <w:r>
+        <w:rPr>
+          <w:rFonts w:ascii="Consolas" w:cs="Consolas" w:eastAsia="Consolas" w:hAnsi="Consolas"/>
+          <w:sz w:val="16"/>
+          <w:szCs w:val="16"/>
+        </w:rPr>
+        <w:t xml:space="preserve">  // a few times over a 20-minute run. Counting those as failed attempts skipped</w:t>
+      </w:r>
+    </w:p>
+    <w:p>
+      <w:pPr>
+        <w:spacing w:after="0" w:line="220"/>
+      </w:pPr>
+      <w:r>
+        <w:rPr>
+          <w:rFonts w:ascii="Consolas" w:cs="Consolas" w:eastAsia="Consolas" w:hAnsi="Consolas"/>
+          <w:sz w:val="16"/>
+          <w:szCs w:val="16"/>
+        </w:rPr>
+        <w:t xml:space="preserve">  // Employee Punch Change mid-way (Q1-Q3 saved, then "redirects instead of an</w:t>
+      </w:r>
+    </w:p>
+    <w:p>
+      <w:pPr>
+        <w:spacing w:after="0" w:line="220"/>
+      </w:pPr>
+      <w:r>
+        <w:rPr>
+          <w:rFonts w:ascii="Consolas" w:cs="Consolas" w:eastAsia="Consolas" w:hAnsi="Consolas"/>
+          <w:sz w:val="16"/>
+          <w:szCs w:val="16"/>
+        </w:rPr>
+        <w:t xml:space="preserve">  // inline Download" and it jumped to the next report). Any produced file proves</w:t>
+      </w:r>
+    </w:p>
+    <w:p>
+      <w:pPr>
+        <w:spacing w:after="0" w:line="220"/>
+      </w:pPr>
+      <w:r>
+        <w:rPr>
+          <w:rFonts w:ascii="Consolas" w:cs="Consolas" w:eastAsia="Consolas" w:hAnsi="Consolas"/>
+          <w:sz w:val="16"/>
+          <w:szCs w:val="16"/>
+        </w:rPr>
+        <w:t xml:space="preserve">  // the page is NOT redirect-looping, so the budget starts fresh.</w:t>
+      </w:r>
+    </w:p>
+    <w:p>
+      <w:pPr>
+        <w:spacing w:after="0" w:line="220"/>
+      </w:pPr>
+      <w:r>
+        <w:rPr>
+          <w:rFonts w:ascii="Consolas" w:cs="Consolas" w:eastAsia="Consolas" w:hAnsi="Consolas"/>
+          <w:sz w:val="16"/>
+          <w:szCs w:val="16"/>
+        </w:rPr>
+        <w:t xml:space="preserve">  function resetAttempt(idx) {</w:t>
+      </w:r>
+    </w:p>
+    <w:p>
+      <w:pPr>
+        <w:spacing w:after="0" w:line="220"/>
+      </w:pPr>
+      <w:r>
+        <w:rPr>
+          <w:rFonts w:ascii="Consolas" w:cs="Consolas" w:eastAsia="Consolas" w:hAnsi="Consolas"/>
+          <w:sz w:val="16"/>
+          <w:szCs w:val="16"/>
+        </w:rPr>
+        <w:t xml:space="preserve">    let a = {};</w:t>
+      </w:r>
+    </w:p>
+    <w:p>
+      <w:pPr>
+        <w:spacing w:after="0" w:line="220"/>
+      </w:pPr>
+      <w:r>
+        <w:rPr>
+          <w:rFonts w:ascii="Consolas" w:cs="Consolas" w:eastAsia="Consolas" w:hAnsi="Consolas"/>
+          <w:sz w:val="16"/>
+          <w:szCs w:val="16"/>
+        </w:rPr>
+        <w:t xml:space="preserve">    try { a = JSON.parse(localStorage.getItem(ATT_KEY) || '{}') || {}; } catch (_) { a = {}; }</w:t>
+      </w:r>
+    </w:p>
+    <w:p>
+      <w:pPr>
+        <w:spacing w:after="0" w:line="220"/>
+      </w:pPr>
+      <w:r>
+        <w:rPr>
+          <w:rFonts w:ascii="Consolas" w:cs="Consolas" w:eastAsia="Consolas" w:hAnsi="Consolas"/>
+          <w:sz w:val="16"/>
+          <w:szCs w:val="16"/>
+        </w:rPr>
+        <w:t xml:space="preserve">    if (a[idx]) { delete a[idx]; try { localStorage.setItem(ATT_KEY, JSON.stringify(a)); } catch (_) {} }</w:t>
+      </w:r>
+    </w:p>
+    <w:p>
+      <w:pPr>
+        <w:spacing w:after="0" w:line="220"/>
+      </w:pPr>
+      <w:r>
+        <w:rPr>
+          <w:rFonts w:ascii="Consolas" w:cs="Consolas" w:eastAsia="Consolas" w:hAnsi="Consolas"/>
+          <w:sz w:val="16"/>
+          <w:szCs w:val="16"/>
+        </w:rPr>
+        <w:t xml:space="preserve">  }</w:t>
+      </w:r>
+    </w:p>
+    <w:p>
+      <w:pPr>
+        <w:spacing w:after="0" w:line="220"/>
+      </w:pPr>
+      <w:r>
+        <w:rPr>
+          <w:rFonts w:ascii="Consolas" w:cs="Consolas" w:eastAsia="Consolas" w:hAnsi="Consolas"/>
+          <w:sz w:val="16"/>
+          <w:szCs w:val="16"/>
+        </w:rPr>
         <w:t xml:space="preserve"> </w:t>
       </w:r>
     </w:p>
@@ -32460,7 +32837,7 @@
           <w:sz w:val="16"/>
           <w:szCs w:val="16"/>
         </w:rPr>
-        <w:t xml:space="preserve">      log('standby: the bot is running in another Paycom tab');</w:t>
+        <w:t xml:space="preserve">      uiLog('⏸ Standing by — the bot is already running in another Paycom tab. Keep only ONE Paycom tab open during a run.');</w:t>
       </w:r>
     </w:p>
     <w:p>
@@ -32499,7 +32876,124 @@
           <w:sz w:val="16"/>
           <w:szCs w:val="16"/>
         </w:rPr>
-        <w:t xml:space="preserve">        if (iAmDriver()) { clearInterval(watch); becomeDriver(); dispatch(); }</w:t>
+        <w:t xml:space="preserve">        if (iAmDriver()) {</w:t>
+      </w:r>
+    </w:p>
+    <w:p>
+      <w:pPr>
+        <w:spacing w:after="0" w:line="220"/>
+      </w:pPr>
+      <w:r>
+        <w:rPr>
+          <w:rFonts w:ascii="Consolas" w:cs="Consolas" w:eastAsia="Consolas" w:hAnsi="Consolas"/>
+          <w:sz w:val="16"/>
+          <w:szCs w:val="16"/>
+        </w:rPr>
+        <w:t xml:space="preserve">          clearInterval(watch);</w:t>
+      </w:r>
+    </w:p>
+    <w:p>
+      <w:pPr>
+        <w:spacing w:after="0" w:line="220"/>
+      </w:pPr>
+      <w:r>
+        <w:rPr>
+          <w:rFonts w:ascii="Consolas" w:cs="Consolas" w:eastAsia="Consolas" w:hAnsi="Consolas"/>
+          <w:sz w:val="16"/>
+          <w:szCs w:val="16"/>
+        </w:rPr>
+        <w:t xml:space="preserve">          // Loud on purpose: if this ever fires while the other tab is actually</w:t>
+      </w:r>
+    </w:p>
+    <w:p>
+      <w:pPr>
+        <w:spacing w:after="0" w:line="220"/>
+      </w:pPr>
+      <w:r>
+        <w:rPr>
+          <w:rFonts w:ascii="Consolas" w:cs="Consolas" w:eastAsia="Consolas" w:hAnsi="Consolas"/>
+          <w:sz w:val="16"/>
+          <w:szCs w:val="16"/>
+        </w:rPr>
+        <w:t xml:space="preserve">          // alive, two tabs are about to drive the same queue and reports will</w:t>
+      </w:r>
+    </w:p>
+    <w:p>
+      <w:pPr>
+        <w:spacing w:after="0" w:line="220"/>
+      </w:pPr>
+      <w:r>
+        <w:rPr>
+          <w:rFonts w:ascii="Consolas" w:cs="Consolas" w:eastAsia="Consolas" w:hAnsi="Consolas"/>
+          <w:sz w:val="16"/>
+          <w:szCs w:val="16"/>
+        </w:rPr>
+        <w:t xml:space="preserve">          // interleave on one form. Seeing it in the log is the only way to tell</w:t>
+      </w:r>
+    </w:p>
+    <w:p>
+      <w:pPr>
+        <w:spacing w:after="0" w:line="220"/>
+      </w:pPr>
+      <w:r>
+        <w:rPr>
+          <w:rFonts w:ascii="Consolas" w:cs="Consolas" w:eastAsia="Consolas" w:hAnsi="Consolas"/>
+          <w:sz w:val="16"/>
+          <w:szCs w:val="16"/>
+        </w:rPr>
+        <w:t xml:space="preserve">          // that apart from a normal "other tab was closed" handover.</w:t>
+      </w:r>
+    </w:p>
+    <w:p>
+      <w:pPr>
+        <w:spacing w:after="0" w:line="220"/>
+      </w:pPr>
+      <w:r>
+        <w:rPr>
+          <w:rFonts w:ascii="Consolas" w:cs="Consolas" w:eastAsia="Consolas" w:hAnsi="Consolas"/>
+          <w:sz w:val="16"/>
+          <w:szCs w:val="16"/>
+        </w:rPr>
+        <w:t xml:space="preserve">          uiLog(`⚠ Taking over the run — the other tab has not checked in for over ${Math.round(LOCK_STALE_MS / 1000)}s.`);</w:t>
+      </w:r>
+    </w:p>
+    <w:p>
+      <w:pPr>
+        <w:spacing w:after="0" w:line="220"/>
+      </w:pPr>
+      <w:r>
+        <w:rPr>
+          <w:rFonts w:ascii="Consolas" w:cs="Consolas" w:eastAsia="Consolas" w:hAnsi="Consolas"/>
+          <w:sz w:val="16"/>
+          <w:szCs w:val="16"/>
+        </w:rPr>
+        <w:t xml:space="preserve">          becomeDriver();</w:t>
+      </w:r>
+    </w:p>
+    <w:p>
+      <w:pPr>
+        <w:spacing w:after="0" w:line="220"/>
+      </w:pPr>
+      <w:r>
+        <w:rPr>
+          <w:rFonts w:ascii="Consolas" w:cs="Consolas" w:eastAsia="Consolas" w:hAnsi="Consolas"/>
+          <w:sz w:val="16"/>
+          <w:szCs w:val="16"/>
+        </w:rPr>
+        <w:t xml:space="preserve">          dispatch();</w:t>
+      </w:r>
+    </w:p>
+    <w:p>
+      <w:pPr>
+        <w:spacing w:after="0" w:line="220"/>
+      </w:pPr>
+      <w:r>
+        <w:rPr>
+          <w:rFonts w:ascii="Consolas" w:cs="Consolas" w:eastAsia="Consolas" w:hAnsi="Consolas"/>
+          <w:sz w:val="16"/>
+          <w:szCs w:val="16"/>
+        </w:rPr>
+        <w:t xml:space="preserve">        }</w:t>
       </w:r>
     </w:p>
     <w:p>

</xml_diff>

<commit_message>
docs: regenerate Paycom Historical Data Bot.docx for v0.32.1
Co-Authored-By: Claude Opus 5 <noreply@anthropic.com>
</commit_message>
<xml_diff>
--- a/distribution-docs/Paycom Historical Data Bot.docx
+++ b/distribution-docs/Paycom Historical Data Bot.docx
@@ -51,7 +51,7 @@
           <w:sz w:val="16"/>
           <w:szCs w:val="16"/>
         </w:rPr>
-        <w:t xml:space="preserve">// @version      0.32.0</w:t>
+        <w:t xml:space="preserve">// @version      0.32.1</w:t>
       </w:r>
     </w:p>
     <w:p>
@@ -12440,7 +12440,98 @@
           <w:sz w:val="16"/>
           <w:szCs w:val="16"/>
         </w:rPr>
-        <w:t xml:space="preserve">    const out = new Map(); // stamp text -&gt; smallest row-ish element containing it</w:t>
+        <w:t xml:space="preserve">    // stamp text -&gt; ALL row-ish elements containing it, in doc order.</w:t>
+      </w:r>
+    </w:p>
+    <w:p>
+      <w:pPr>
+        <w:spacing w:after="0" w:line="220"/>
+      </w:pPr>
+      <w:r>
+        <w:rPr>
+          <w:rFonts w:ascii="Consolas" w:cs="Consolas" w:eastAsia="Consolas" w:hAnsi="Consolas"/>
+          <w:sz w:val="16"/>
+          <w:szCs w:val="16"/>
+        </w:rPr>
+        <w:t xml:space="preserve">    // The same stamp can appear in MORE than one place — e.g. with</w:t>
+      </w:r>
+    </w:p>
+    <w:p>
+      <w:pPr>
+        <w:spacing w:after="0" w:line="220"/>
+      </w:pPr>
+      <w:r>
+        <w:rPr>
+          <w:rFonts w:ascii="Consolas" w:cs="Consolas" w:eastAsia="Consolas" w:hAnsi="Consolas"/>
+          <w:sz w:val="16"/>
+          <w:szCs w:val="16"/>
+        </w:rPr>
+        <w:t xml:space="preserve">    // override-report-hub=1 the legacy list is shown but the Report Hub keeps a</w:t>
+      </w:r>
+    </w:p>
+    <w:p>
+      <w:pPr>
+        <w:spacing w:after="0" w:line="220"/>
+      </w:pPr>
+      <w:r>
+        <w:rPr>
+          <w:rFonts w:ascii="Consolas" w:cs="Consolas" w:eastAsia="Consolas" w:hAnsi="Consolas"/>
+          <w:sz w:val="16"/>
+          <w:szCs w:val="16"/>
+        </w:rPr>
+        <w:t xml:space="preserve">    // HIDDEN copy of the same rows later in the DOM. Keeping only the last</w:t>
+      </w:r>
+    </w:p>
+    <w:p>
+      <w:pPr>
+        <w:spacing w:after="0" w:line="220"/>
+      </w:pPr>
+      <w:r>
+        <w:rPr>
+          <w:rFonts w:ascii="Consolas" w:cs="Consolas" w:eastAsia="Consolas" w:hAnsi="Consolas"/>
+          <w:sz w:val="16"/>
+          <w:szCs w:val="16"/>
+        </w:rPr>
+        <w:t xml:space="preserve">    // element (the old behavior) could hand back the hidden copy, whose</w:t>
+      </w:r>
+    </w:p>
+    <w:p>
+      <w:pPr>
+        <w:spacing w:after="0" w:line="220"/>
+      </w:pPr>
+      <w:r>
+        <w:rPr>
+          <w:rFonts w:ascii="Consolas" w:cs="Consolas" w:eastAsia="Consolas" w:hAnsi="Consolas"/>
+          <w:sz w:val="16"/>
+          <w:szCs w:val="16"/>
+        </w:rPr>
+        <w:t xml:space="preserve">    // Download button never passes visible() — and the watcher then waits</w:t>
+      </w:r>
+    </w:p>
+    <w:p>
+      <w:pPr>
+        <w:spacing w:after="0" w:line="220"/>
+      </w:pPr>
+      <w:r>
+        <w:rPr>
+          <w:rFonts w:ascii="Consolas" w:cs="Consolas" w:eastAsia="Consolas" w:hAnsi="Consolas"/>
+          <w:sz w:val="16"/>
+          <w:szCs w:val="16"/>
+        </w:rPr>
+        <w:t xml:space="preserve">    // forever while a perfectly clickable button sits on screen.</w:t>
+      </w:r>
+    </w:p>
+    <w:p>
+      <w:pPr>
+        <w:spacing w:after="0" w:line="220"/>
+      </w:pPr>
+      <w:r>
+        <w:rPr>
+          <w:rFonts w:ascii="Consolas" w:cs="Consolas" w:eastAsia="Consolas" w:hAnsi="Consolas"/>
+          <w:sz w:val="16"/>
+          <w:szCs w:val="16"/>
+        </w:rPr>
+        <w:t xml:space="preserve">    const out = new Map();</w:t>
       </w:r>
     </w:p>
     <w:p>
@@ -12505,7 +12596,46 @@
           <w:sz w:val="16"/>
           <w:szCs w:val="16"/>
         </w:rPr>
-        <w:t xml:space="preserve">      if (m) out.set(m[0], el); // doc order: children overwrite parents → smallest block wins</w:t>
+        <w:t xml:space="preserve">      if (!m) continue;</w:t>
+      </w:r>
+    </w:p>
+    <w:p>
+      <w:pPr>
+        <w:spacing w:after="0" w:line="220"/>
+      </w:pPr>
+      <w:r>
+        <w:rPr>
+          <w:rFonts w:ascii="Consolas" w:cs="Consolas" w:eastAsia="Consolas" w:hAnsi="Consolas"/>
+          <w:sz w:val="16"/>
+          <w:szCs w:val="16"/>
+        </w:rPr>
+        <w:t xml:space="preserve">      const list = out.get(m[0]) || [];</w:t>
+      </w:r>
+    </w:p>
+    <w:p>
+      <w:pPr>
+        <w:spacing w:after="0" w:line="220"/>
+      </w:pPr>
+      <w:r>
+        <w:rPr>
+          <w:rFonts w:ascii="Consolas" w:cs="Consolas" w:eastAsia="Consolas" w:hAnsi="Consolas"/>
+          <w:sz w:val="16"/>
+          <w:szCs w:val="16"/>
+        </w:rPr>
+        <w:t xml:space="preserve">      list.push(el);</w:t>
+      </w:r>
+    </w:p>
+    <w:p>
+      <w:pPr>
+        <w:spacing w:after="0" w:line="220"/>
+      </w:pPr>
+      <w:r>
+        <w:rPr>
+          <w:rFonts w:ascii="Consolas" w:cs="Consolas" w:eastAsia="Consolas" w:hAnsi="Consolas"/>
+          <w:sz w:val="16"/>
+          <w:szCs w:val="16"/>
+        </w:rPr>
+        <w:t xml:space="preserve">      out.set(m[0], list);</w:t>
       </w:r>
     </w:p>
     <w:p>
@@ -12557,6 +12687,149 @@
           <w:sz w:val="16"/>
           <w:szCs w:val="16"/>
         </w:rPr>
+        <w:t xml:space="preserve">  // Try every element bearing this stamp, innermost/lattermost first, until one</w:t>
+      </w:r>
+    </w:p>
+    <w:p>
+      <w:pPr>
+        <w:spacing w:after="0" w:line="220"/>
+      </w:pPr>
+      <w:r>
+        <w:rPr>
+          <w:rFonts w:ascii="Consolas" w:cs="Consolas" w:eastAsia="Consolas" w:hAnsi="Consolas"/>
+          <w:sz w:val="16"/>
+          <w:szCs w:val="16"/>
+        </w:rPr>
+        <w:t xml:space="preserve">  // yields a VISIBLE Download button. Hidden duplicates simply fail the</w:t>
+      </w:r>
+    </w:p>
+    <w:p>
+      <w:pPr>
+        <w:spacing w:after="0" w:line="220"/>
+      </w:pPr>
+      <w:r>
+        <w:rPr>
+          <w:rFonts w:ascii="Consolas" w:cs="Consolas" w:eastAsia="Consolas" w:hAnsi="Consolas"/>
+          <w:sz w:val="16"/>
+          <w:szCs w:val="16"/>
+        </w:rPr>
+        <w:t xml:space="preserve">  // visible() filter inside downloadButtonInRow and the next candidate wins.</w:t>
+      </w:r>
+    </w:p>
+    <w:p>
+      <w:pPr>
+        <w:spacing w:after="0" w:line="220"/>
+      </w:pPr>
+      <w:r>
+        <w:rPr>
+          <w:rFonts w:ascii="Consolas" w:cs="Consolas" w:eastAsia="Consolas" w:hAnsi="Consolas"/>
+          <w:sz w:val="16"/>
+          <w:szCs w:val="16"/>
+        </w:rPr>
+        <w:t xml:space="preserve">  function downloadButtonForStamp(candidates) {</w:t>
+      </w:r>
+    </w:p>
+    <w:p>
+      <w:pPr>
+        <w:spacing w:after="0" w:line="220"/>
+      </w:pPr>
+      <w:r>
+        <w:rPr>
+          <w:rFonts w:ascii="Consolas" w:cs="Consolas" w:eastAsia="Consolas" w:hAnsi="Consolas"/>
+          <w:sz w:val="16"/>
+          <w:szCs w:val="16"/>
+        </w:rPr>
+        <w:t xml:space="preserve">    if (!candidates) return null;</w:t>
+      </w:r>
+    </w:p>
+    <w:p>
+      <w:pPr>
+        <w:spacing w:after="0" w:line="220"/>
+      </w:pPr>
+      <w:r>
+        <w:rPr>
+          <w:rFonts w:ascii="Consolas" w:cs="Consolas" w:eastAsia="Consolas" w:hAnsi="Consolas"/>
+          <w:sz w:val="16"/>
+          <w:szCs w:val="16"/>
+        </w:rPr>
+        <w:t xml:space="preserve">    for (let i = candidates.length - 1; i &gt;= 0; i--) {</w:t>
+      </w:r>
+    </w:p>
+    <w:p>
+      <w:pPr>
+        <w:spacing w:after="0" w:line="220"/>
+      </w:pPr>
+      <w:r>
+        <w:rPr>
+          <w:rFonts w:ascii="Consolas" w:cs="Consolas" w:eastAsia="Consolas" w:hAnsi="Consolas"/>
+          <w:sz w:val="16"/>
+          <w:szCs w:val="16"/>
+        </w:rPr>
+        <w:t xml:space="preserve">      const btn = downloadButtonInRow(candidates[i]);</w:t>
+      </w:r>
+    </w:p>
+    <w:p>
+      <w:pPr>
+        <w:spacing w:after="0" w:line="220"/>
+      </w:pPr>
+      <w:r>
+        <w:rPr>
+          <w:rFonts w:ascii="Consolas" w:cs="Consolas" w:eastAsia="Consolas" w:hAnsi="Consolas"/>
+          <w:sz w:val="16"/>
+          <w:szCs w:val="16"/>
+        </w:rPr>
+        <w:t xml:space="preserve">      if (btn) return btn;</w:t>
+      </w:r>
+    </w:p>
+    <w:p>
+      <w:pPr>
+        <w:spacing w:after="0" w:line="220"/>
+      </w:pPr>
+      <w:r>
+        <w:rPr>
+          <w:rFonts w:ascii="Consolas" w:cs="Consolas" w:eastAsia="Consolas" w:hAnsi="Consolas"/>
+          <w:sz w:val="16"/>
+          <w:szCs w:val="16"/>
+        </w:rPr>
+        <w:t xml:space="preserve">    }</w:t>
+      </w:r>
+    </w:p>
+    <w:p>
+      <w:pPr>
+        <w:spacing w:after="0" w:line="220"/>
+      </w:pPr>
+      <w:r>
+        <w:rPr>
+          <w:rFonts w:ascii="Consolas" w:cs="Consolas" w:eastAsia="Consolas" w:hAnsi="Consolas"/>
+          <w:sz w:val="16"/>
+          <w:szCs w:val="16"/>
+        </w:rPr>
+        <w:t xml:space="preserve">    return null;</w:t>
+      </w:r>
+    </w:p>
+    <w:p>
+      <w:pPr>
+        <w:spacing w:after="0" w:line="220"/>
+      </w:pPr>
+      <w:r>
+        <w:rPr>
+          <w:rFonts w:ascii="Consolas" w:cs="Consolas" w:eastAsia="Consolas" w:hAnsi="Consolas"/>
+          <w:sz w:val="16"/>
+          <w:szCs w:val="16"/>
+        </w:rPr>
+        <w:t xml:space="preserve">  }</w:t>
+      </w:r>
+    </w:p>
+    <w:p>
+      <w:pPr>
+        <w:spacing w:after="0" w:line="220"/>
+      </w:pPr>
+      <w:r>
+        <w:rPr>
+          <w:rFonts w:ascii="Consolas" w:cs="Consolas" w:eastAsia="Consolas" w:hAnsi="Consolas"/>
+          <w:sz w:val="16"/>
+          <w:szCs w:val="16"/>
+        </w:rPr>
         <w:t xml:space="preserve">  // The stamp usually matches a tiny inner element (just the timestamp text);</w:t>
       </w:r>
     </w:p>
@@ -14260,20 +14533,7 @@
           <w:sz w:val="16"/>
           <w:szCs w:val="16"/>
         </w:rPr>
-        <w:t xml:space="preserve">        const row = rows.get(stamp);</w:t>
-      </w:r>
-    </w:p>
-    <w:p>
-      <w:pPr>
-        <w:spacing w:after="0" w:line="220"/>
-      </w:pPr>
-      <w:r>
-        <w:rPr>
-          <w:rFonts w:ascii="Consolas" w:cs="Consolas" w:eastAsia="Consolas" w:hAnsi="Consolas"/>
-          <w:sz w:val="16"/>
-          <w:szCs w:val="16"/>
-        </w:rPr>
-        <w:t xml:space="preserve">        const btn = row &amp;&amp; downloadButtonInRow(row);</w:t>
+        <w:t xml:space="preserve">        const btn = downloadButtonForStamp(rows.get(stamp));</w:t>
       </w:r>
     </w:p>
     <w:p>
@@ -20461,6 +20721,58 @@
           <w:sz w:val="16"/>
           <w:szCs w:val="16"/>
         </w:rPr>
+        <w:t xml:space="preserve">    // Waiting here is normal (the report is generating) — but it must never be</w:t>
+      </w:r>
+    </w:p>
+    <w:p>
+      <w:pPr>
+        <w:spacing w:after="0" w:line="220"/>
+      </w:pPr>
+      <w:r>
+        <w:rPr>
+          <w:rFonts w:ascii="Consolas" w:cs="Consolas" w:eastAsia="Consolas" w:hAnsi="Consolas"/>
+          <w:sz w:val="16"/>
+          <w:szCs w:val="16"/>
+        </w:rPr>
+        <w:t xml:space="preserve">    // SILENT: log what the watcher sees every 30s so a detection failure is</w:t>
+      </w:r>
+    </w:p>
+    <w:p>
+      <w:pPr>
+        <w:spacing w:after="0" w:line="220"/>
+      </w:pPr>
+      <w:r>
+        <w:rPr>
+          <w:rFonts w:ascii="Consolas" w:cs="Consolas" w:eastAsia="Consolas" w:hAnsi="Consolas"/>
+          <w:sz w:val="16"/>
+          <w:szCs w:val="16"/>
+        </w:rPr>
+        <w:t xml:space="preserve">    // visible in the activity log instead of looking like a slow report.</w:t>
+      </w:r>
+    </w:p>
+    <w:p>
+      <w:pPr>
+        <w:spacing w:after="0" w:line="220"/>
+      </w:pPr>
+      <w:r>
+        <w:rPr>
+          <w:rFonts w:ascii="Consolas" w:cs="Consolas" w:eastAsia="Consolas" w:hAnsi="Consolas"/>
+          <w:sz w:val="16"/>
+          <w:szCs w:val="16"/>
+        </w:rPr>
+        <w:t xml:space="preserve">    let lastDiag = 0;</w:t>
+      </w:r>
+    </w:p>
+    <w:p>
+      <w:pPr>
+        <w:spacing w:after="0" w:line="220"/>
+      </w:pPr>
+      <w:r>
+        <w:rPr>
+          <w:rFonts w:ascii="Consolas" w:cs="Consolas" w:eastAsia="Consolas" w:hAnsi="Consolas"/>
+          <w:sz w:val="16"/>
+          <w:szCs w:val="16"/>
+        </w:rPr>
         <w:t xml:space="preserve">    const found = await waitFor(() =&gt; {</w:t>
       </w:r>
     </w:p>
@@ -20487,7 +20799,7 @@
           <w:sz w:val="16"/>
           <w:szCs w:val="16"/>
         </w:rPr>
-        <w:t xml:space="preserve">        .map(([stamp, el]) =&gt; ({ stamp, el, t: parseStamp(stamp) }))</w:t>
+        <w:t xml:space="preserve">        .map(([stamp, cands]) =&gt; ({ stamp, cands, t: parseStamp(stamp) }))</w:t>
       </w:r>
     </w:p>
     <w:p>
@@ -20526,7 +20838,72 @@
           <w:sz w:val="16"/>
           <w:szCs w:val="16"/>
         </w:rPr>
-        <w:t xml:space="preserve">      if (!newest) return null;</w:t>
+        <w:t xml:space="preserve">      const diag = (msg) =&gt; {</w:t>
+      </w:r>
+    </w:p>
+    <w:p>
+      <w:pPr>
+        <w:spacing w:after="0" w:line="220"/>
+      </w:pPr>
+      <w:r>
+        <w:rPr>
+          <w:rFonts w:ascii="Consolas" w:cs="Consolas" w:eastAsia="Consolas" w:hAnsi="Consolas"/>
+          <w:sz w:val="16"/>
+          <w:szCs w:val="16"/>
+        </w:rPr>
+        <w:t xml:space="preserve">        if (Date.now() - lastDiag &lt; 30000) return;</w:t>
+      </w:r>
+    </w:p>
+    <w:p>
+      <w:pPr>
+        <w:spacing w:after="0" w:line="220"/>
+      </w:pPr>
+      <w:r>
+        <w:rPr>
+          <w:rFonts w:ascii="Consolas" w:cs="Consolas" w:eastAsia="Consolas" w:hAnsi="Consolas"/>
+          <w:sz w:val="16"/>
+          <w:szCs w:val="16"/>
+        </w:rPr>
+        <w:t xml:space="preserve">        lastDiag = Date.now();</w:t>
+      </w:r>
+    </w:p>
+    <w:p>
+      <w:pPr>
+        <w:spacing w:after="0" w:line="220"/>
+      </w:pPr>
+      <w:r>
+        <w:rPr>
+          <w:rFonts w:ascii="Consolas" w:cs="Consolas" w:eastAsia="Consolas" w:hAnsi="Consolas"/>
+          <w:sz w:val="16"/>
+          <w:szCs w:val="16"/>
+        </w:rPr>
+        <w:t xml:space="preserve">        uiLog(`  … queue watch: ${rows.length} row(s); ${msg}`);</w:t>
+      </w:r>
+    </w:p>
+    <w:p>
+      <w:pPr>
+        <w:spacing w:after="0" w:line="220"/>
+      </w:pPr>
+      <w:r>
+        <w:rPr>
+          <w:rFonts w:ascii="Consolas" w:cs="Consolas" w:eastAsia="Consolas" w:hAnsi="Consolas"/>
+          <w:sz w:val="16"/>
+          <w:szCs w:val="16"/>
+        </w:rPr>
+        <w:t xml:space="preserve">      };</w:t>
+      </w:r>
+    </w:p>
+    <w:p>
+      <w:pPr>
+        <w:spacing w:after="0" w:line="220"/>
+      </w:pPr>
+      <w:r>
+        <w:rPr>
+          <w:rFonts w:ascii="Consolas" w:cs="Consolas" w:eastAsia="Consolas" w:hAnsi="Consolas"/>
+          <w:sz w:val="16"/>
+          <w:szCs w:val="16"/>
+        </w:rPr>
+        <w:t xml:space="preserve">      if (!newest) { diag('no timestamped rows found on this page'); return null; }</w:t>
       </w:r>
     </w:p>
     <w:p>
@@ -20565,33 +20942,85 @@
           <w:sz w:val="16"/>
           <w:szCs w:val="16"/>
         </w:rPr>
-        <w:t xml:space="preserve">      if (lastStamp &amp;&amp; newest.stamp === lastStamp) return null;</w:t>
-      </w:r>
-    </w:p>
-    <w:p>
-      <w:pPr>
-        <w:spacing w:after="0" w:line="220"/>
-      </w:pPr>
-      <w:r>
-        <w:rPr>
-          <w:rFonts w:ascii="Consolas" w:cs="Consolas" w:eastAsia="Consolas" w:hAnsi="Consolas"/>
-          <w:sz w:val="16"/>
-          <w:szCs w:val="16"/>
-        </w:rPr>
-        <w:t xml:space="preserve">      const btn = downloadButtonInRow(newest.el);</w:t>
-      </w:r>
-    </w:p>
-    <w:p>
-      <w:pPr>
-        <w:spacing w:after="0" w:line="220"/>
-      </w:pPr>
-      <w:r>
-        <w:rPr>
-          <w:rFonts w:ascii="Consolas" w:cs="Consolas" w:eastAsia="Consolas" w:hAnsi="Consolas"/>
-          <w:sz w:val="16"/>
-          <w:szCs w:val="16"/>
-        </w:rPr>
-        <w:t xml:space="preserve">      return btn ? { btn, stamp: newest.stamp } : null; // still generating → wait</w:t>
+        <w:t xml:space="preserve">      if (lastStamp &amp;&amp; newest.stamp === lastStamp) {</w:t>
+      </w:r>
+    </w:p>
+    <w:p>
+      <w:pPr>
+        <w:spacing w:after="0" w:line="220"/>
+      </w:pPr>
+      <w:r>
+        <w:rPr>
+          <w:rFonts w:ascii="Consolas" w:cs="Consolas" w:eastAsia="Consolas" w:hAnsi="Consolas"/>
+          <w:sz w:val="16"/>
+          <w:szCs w:val="16"/>
+        </w:rPr>
+        <w:t xml:space="preserve">        diag(`newest (${newest.stamp}) is the previous range's row — ours not queued yet`);</w:t>
+      </w:r>
+    </w:p>
+    <w:p>
+      <w:pPr>
+        <w:spacing w:after="0" w:line="220"/>
+      </w:pPr>
+      <w:r>
+        <w:rPr>
+          <w:rFonts w:ascii="Consolas" w:cs="Consolas" w:eastAsia="Consolas" w:hAnsi="Consolas"/>
+          <w:sz w:val="16"/>
+          <w:szCs w:val="16"/>
+        </w:rPr>
+        <w:t xml:space="preserve">        return null;</w:t>
+      </w:r>
+    </w:p>
+    <w:p>
+      <w:pPr>
+        <w:spacing w:after="0" w:line="220"/>
+      </w:pPr>
+      <w:r>
+        <w:rPr>
+          <w:rFonts w:ascii="Consolas" w:cs="Consolas" w:eastAsia="Consolas" w:hAnsi="Consolas"/>
+          <w:sz w:val="16"/>
+          <w:szCs w:val="16"/>
+        </w:rPr>
+        <w:t xml:space="preserve">      }</w:t>
+      </w:r>
+    </w:p>
+    <w:p>
+      <w:pPr>
+        <w:spacing w:after="0" w:line="220"/>
+      </w:pPr>
+      <w:r>
+        <w:rPr>
+          <w:rFonts w:ascii="Consolas" w:cs="Consolas" w:eastAsia="Consolas" w:hAnsi="Consolas"/>
+          <w:sz w:val="16"/>
+          <w:szCs w:val="16"/>
+        </w:rPr>
+        <w:t xml:space="preserve">      const btn = downloadButtonForStamp(newest.cands);</w:t>
+      </w:r>
+    </w:p>
+    <w:p>
+      <w:pPr>
+        <w:spacing w:after="0" w:line="220"/>
+      </w:pPr>
+      <w:r>
+        <w:rPr>
+          <w:rFonts w:ascii="Consolas" w:cs="Consolas" w:eastAsia="Consolas" w:hAnsi="Consolas"/>
+          <w:sz w:val="16"/>
+          <w:szCs w:val="16"/>
+        </w:rPr>
+        <w:t xml:space="preserve">      if (!btn) { diag(`newest ${newest.stamp}: no visible Download button yet (still generating?)`); return null; }</w:t>
+      </w:r>
+    </w:p>
+    <w:p>
+      <w:pPr>
+        <w:spacing w:after="0" w:line="220"/>
+      </w:pPr>
+      <w:r>
+        <w:rPr>
+          <w:rFonts w:ascii="Consolas" w:cs="Consolas" w:eastAsia="Consolas" w:hAnsi="Consolas"/>
+          <w:sz w:val="16"/>
+          <w:szCs w:val="16"/>
+        </w:rPr>
+        <w:t xml:space="preserve">      return { btn, stamp: newest.stamp };</w:t>
       </w:r>
     </w:p>
     <w:p>

</xml_diff>

<commit_message>
fix(paycom-historical): log the download fetch instead of going silent for 3 minutes (v0.32.2)
downloadViaButton fetches the report body directly (to keep OUR filename
instead of Paycom's default MyAdvRpt.csv). That fetch has a 180s timeout and
emitted NOTHING until it finished — so once the watcher found the row, the
activity log went quiet for up to three minutes while a Download button sat on
screen. Reported live twice as 'download button aa gaya, click hi nahi kar
raha'; the file did land both times (Prior Payroll 2023 and 2024, verified).

- log the fileName + transid immediately before fetching
- report elapsed seconds on success, unexpected content, HTTP error and abort
- log the click-the-real-button fallback explicitly

Co-Authored-By: Claude Opus 5 <noreply@anthropic.com>
</commit_message>
<xml_diff>
--- a/distribution-docs/Paycom Historical Data Bot.docx
+++ b/distribution-docs/Paycom Historical Data Bot.docx
@@ -51,7 +51,7 @@
           <w:sz w:val="16"/>
           <w:szCs w:val="16"/>
         </w:rPr>
-        <w:t xml:space="preserve">// @version      0.32.1</w:t>
+        <w:t xml:space="preserve">// @version      0.32.2</w:t>
       </w:r>
     </w:p>
     <w:p>
@@ -11140,6 +11140,110 @@
           <w:sz w:val="16"/>
           <w:szCs w:val="16"/>
         </w:rPr>
+        <w:t xml:space="preserve">    // Say so BEFORE the fetch. A big report can take minutes to transfer, and</w:t>
+      </w:r>
+    </w:p>
+    <w:p>
+      <w:pPr>
+        <w:spacing w:after="0" w:line="220"/>
+      </w:pPr>
+      <w:r>
+        <w:rPr>
+          <w:rFonts w:ascii="Consolas" w:cs="Consolas" w:eastAsia="Consolas" w:hAnsi="Consolas"/>
+          <w:sz w:val="16"/>
+          <w:szCs w:val="16"/>
+        </w:rPr>
+        <w:t xml:space="preserve">    // without this line the log goes silent for up to 3 minutes while a</w:t>
+      </w:r>
+    </w:p>
+    <w:p>
+      <w:pPr>
+        <w:spacing w:after="0" w:line="220"/>
+      </w:pPr>
+      <w:r>
+        <w:rPr>
+          <w:rFonts w:ascii="Consolas" w:cs="Consolas" w:eastAsia="Consolas" w:hAnsi="Consolas"/>
+          <w:sz w:val="16"/>
+          <w:szCs w:val="16"/>
+        </w:rPr>
+        <w:t xml:space="preserve">    // Download button sits on screen — which reads as "the bot is stuck and</w:t>
+      </w:r>
+    </w:p>
+    <w:p>
+      <w:pPr>
+        <w:spacing w:after="0" w:line="220"/>
+      </w:pPr>
+      <w:r>
+        <w:rPr>
+          <w:rFonts w:ascii="Consolas" w:cs="Consolas" w:eastAsia="Consolas" w:hAnsi="Consolas"/>
+          <w:sz w:val="16"/>
+          <w:szCs w:val="16"/>
+        </w:rPr>
+        <w:t xml:space="preserve">    // refusing to click" (reported live on Prior Payroll 2023/2024).</w:t>
+      </w:r>
+    </w:p>
+    <w:p>
+      <w:pPr>
+        <w:spacing w:after="0" w:line="220"/>
+      </w:pPr>
+      <w:r>
+        <w:rPr>
+          <w:rFonts w:ascii="Consolas" w:cs="Consolas" w:eastAsia="Consolas" w:hAnsi="Consolas"/>
+          <w:sz w:val="16"/>
+          <w:szCs w:val="16"/>
+        </w:rPr>
+        <w:t xml:space="preserve">    uiLog(`  ↓ fetching ${fileName} (transid ${transid || '?'}) — big files take a few minutes…`);</w:t>
+      </w:r>
+    </w:p>
+    <w:p>
+      <w:pPr>
+        <w:spacing w:after="0" w:line="220"/>
+      </w:pPr>
+      <w:r>
+        <w:rPr>
+          <w:rFonts w:ascii="Consolas" w:cs="Consolas" w:eastAsia="Consolas" w:hAnsi="Consolas"/>
+          <w:sz w:val="16"/>
+          <w:szCs w:val="16"/>
+        </w:rPr>
+        <w:t xml:space="preserve">    const fetchT0 = Date.now();</w:t>
+      </w:r>
+    </w:p>
+    <w:p>
+      <w:pPr>
+        <w:spacing w:after="0" w:line="220"/>
+      </w:pPr>
+      <w:r>
+        <w:rPr>
+          <w:rFonts w:ascii="Consolas" w:cs="Consolas" w:eastAsia="Consolas" w:hAnsi="Consolas"/>
+          <w:sz w:val="16"/>
+          <w:szCs w:val="16"/>
+        </w:rPr>
+        <w:t xml:space="preserve">    const secs = () =&gt; Math.round((Date.now() - fetchT0) / 1000);</w:t>
+      </w:r>
+    </w:p>
+    <w:p>
+      <w:pPr>
+        <w:spacing w:after="0" w:line="220"/>
+      </w:pPr>
+      <w:r>
+        <w:rPr>
+          <w:rFonts w:ascii="Consolas" w:cs="Consolas" w:eastAsia="Consolas" w:hAnsi="Consolas"/>
+          <w:sz w:val="16"/>
+          <w:szCs w:val="16"/>
+        </w:rPr>
+        <w:t xml:space="preserve"> </w:t>
+      </w:r>
+    </w:p>
+    <w:p>
+      <w:pPr>
+        <w:spacing w:after="0" w:line="220"/>
+      </w:pPr>
+      <w:r>
+        <w:rPr>
+          <w:rFonts w:ascii="Consolas" w:cs="Consolas" w:eastAsia="Consolas" w:hAnsi="Consolas"/>
+          <w:sz w:val="16"/>
+          <w:szCs w:val="16"/>
+        </w:rPr>
         <w:t xml:space="preserve">    if (transid &amp;&amp; nonce) {</w:t>
       </w:r>
     </w:p>
@@ -11309,7 +11413,7 @@
           <w:sz w:val="16"/>
           <w:szCs w:val="16"/>
         </w:rPr>
-        <w:t xml:space="preserve">            uiLog(`✓ Saved ${fileName} (${Math.round(blob.size / 1024)} KB)`);</w:t>
+        <w:t xml:space="preserve">            uiLog(`✓ Saved ${fileName} (${Math.round(blob.size / 1024)} KB in ${secs()}s)`);</w:t>
       </w:r>
     </w:p>
     <w:p>
@@ -11348,7 +11452,7 @@
           <w:sz w:val="16"/>
           <w:szCs w:val="16"/>
         </w:rPr>
-        <w:t xml:space="preserve">          uiLog(`⚠ generateproc gave unexpected content (${blob.type || 'no-type'}, ${blob.size}B) — using Paycom download`);</w:t>
+        <w:t xml:space="preserve">          uiLog(`⚠ generateproc gave unexpected content (${blob.type || 'no-type'}, ${blob.size}B) after ${secs()}s — using Paycom download`);</w:t>
       </w:r>
     </w:p>
     <w:p>
@@ -11374,7 +11478,7 @@
           <w:sz w:val="16"/>
           <w:szCs w:val="16"/>
         </w:rPr>
-        <w:t xml:space="preserve">          uiLog(`⚠ generateproc HTTP ${resp.status} — using Paycom download`);</w:t>
+        <w:t xml:space="preserve">          uiLog(`⚠ generateproc HTTP ${resp.status} after ${secs()}s — using Paycom download`);</w:t>
       </w:r>
     </w:p>
     <w:p>
@@ -11426,7 +11530,7 @@
           <w:sz w:val="16"/>
           <w:szCs w:val="16"/>
         </w:rPr>
-        <w:t xml:space="preserve">        uiLog('⚠ generateproc fetch failed — using Paycom download: ' + (e &amp;&amp; e.message));</w:t>
+        <w:t xml:space="preserve">        uiLog(`⚠ generateproc fetch failed after ${secs()}s — using Paycom download: ` + (e &amp;&amp; e.message));</w:t>
       </w:r>
     </w:p>
     <w:p>
@@ -11479,6 +11583,19 @@
           <w:szCs w:val="16"/>
         </w:rPr>
         <w:t xml:space="preserve">    }</w:t>
+      </w:r>
+    </w:p>
+    <w:p>
+      <w:pPr>
+        <w:spacing w:after="0" w:line="220"/>
+      </w:pPr>
+      <w:r>
+        <w:rPr>
+          <w:rFonts w:ascii="Consolas" w:cs="Consolas" w:eastAsia="Consolas" w:hAnsi="Consolas"/>
+          <w:sz w:val="16"/>
+          <w:szCs w:val="16"/>
+        </w:rPr>
+        <w:t xml:space="preserve">    uiLog('  ↓ falling back to Paycom\'s own Download button (file keeps Paycom\'s default name)');</w:t>
       </w:r>
     </w:p>
     <w:p>

</xml_diff>